<commit_message>
Revise milestone 4 deliverable formatting fixes
</commit_message>
<xml_diff>
--- a/capstone/work/milestone4/Milestone4.docx
+++ b/capstone/work/milestone4/Milestone4.docx
@@ -301,130 +301,110 @@
         <w:rPr>
           <w:lang w:val="en-CA"/>
         </w:rPr>
-        <w:t xml:space="preserve">The milestone 4 preprocessing workflow was designed to take raw datasets collected in milestone 3 and transform them into modeling-ready analysis tables that were leakage-aware. Because the only restructuring required by UCI was minimal since it was already a single clean CSV file, more extensive student-level build processes were needed for the </w:t>
+        <w:t>The Milestone 4 preprocessing workflow was designed to take raw datasets collected in Milestone 3 and transform them into modeling-ready analysis tables that were leakage-aware. Because the only restructuring required by UCI was minimal since it was already a single clean CSV file, more extensive student-level build processes were needed for the OULAD dataset than for UCI's, as relevant information was spaced across several databases (studentInfo, studentRegistration, courses, assessments, studentAssessment, vle, studentVle). The final output of the preprocessing workflows was three datasets; one direct UCI multiclass benchmark dataset for reproduction, one UCI early warning binary dataset with second semester leakage removed, and one OULAD early warning binary dataset aggregated at the student module presentation level.</w:t>
       </w:r>
       <w:proofErr w:type="spellStart"/>
       <w:r>
         <w:rPr>
           <w:lang w:val="en-CA"/>
         </w:rPr>
-        <w:t>oulad</w:t>
       </w:r>
       <w:proofErr w:type="spellEnd"/>
       <w:r>
         <w:rPr>
           <w:lang w:val="en-CA"/>
         </w:rPr>
-        <w:t xml:space="preserve"> dataset than for </w:t>
       </w:r>
       <w:proofErr w:type="gramStart"/>
       <w:r>
         <w:rPr>
           <w:lang w:val="en-CA"/>
         </w:rPr>
-        <w:t>UCI's</w:t>
       </w:r>
       <w:proofErr w:type="gramEnd"/>
       <w:r>
         <w:rPr>
           <w:lang w:val="en-CA"/>
         </w:rPr>
-        <w:t>, as relevant information was spaced across several databases (</w:t>
       </w:r>
       <w:proofErr w:type="spellStart"/>
       <w:r>
         <w:rPr>
           <w:lang w:val="en-CA"/>
         </w:rPr>
-        <w:t>studentinfo</w:t>
       </w:r>
       <w:proofErr w:type="spellEnd"/>
       <w:r>
         <w:rPr>
           <w:lang w:val="en-CA"/>
         </w:rPr>
-        <w:t xml:space="preserve">, </w:t>
       </w:r>
       <w:proofErr w:type="spellStart"/>
       <w:r>
         <w:rPr>
           <w:lang w:val="en-CA"/>
         </w:rPr>
-        <w:t>studenregistration</w:t>
       </w:r>
       <w:proofErr w:type="spellEnd"/>
       <w:r>
         <w:rPr>
           <w:lang w:val="en-CA"/>
         </w:rPr>
-        <w:t xml:space="preserve">, courses, assessments, </w:t>
       </w:r>
       <w:proofErr w:type="spellStart"/>
       <w:r>
         <w:rPr>
           <w:lang w:val="en-CA"/>
         </w:rPr>
-        <w:t>studentassessment</w:t>
       </w:r>
       <w:proofErr w:type="spellEnd"/>
       <w:r>
         <w:rPr>
           <w:lang w:val="en-CA"/>
         </w:rPr>
-        <w:t xml:space="preserve">, </w:t>
       </w:r>
       <w:proofErr w:type="spellStart"/>
       <w:r>
         <w:rPr>
           <w:lang w:val="en-CA"/>
         </w:rPr>
-        <w:t>vle</w:t>
       </w:r>
       <w:proofErr w:type="spellEnd"/>
       <w:r>
         <w:rPr>
           <w:lang w:val="en-CA"/>
         </w:rPr>
-        <w:t xml:space="preserve">, </w:t>
       </w:r>
       <w:proofErr w:type="spellStart"/>
       <w:r>
         <w:rPr>
           <w:lang w:val="en-CA"/>
         </w:rPr>
-        <w:t>studentvle</w:t>
       </w:r>
       <w:proofErr w:type="spellEnd"/>
       <w:r>
         <w:rPr>
           <w:lang w:val="en-CA"/>
         </w:rPr>
-        <w:t xml:space="preserve">). The final output of the preprocessing workflows was three datasets; one direct UCI multiclass benchmark dataset for </w:t>
       </w:r>
       <w:r>
         <w:rPr>
           <w:lang w:val="en-CA"/>
         </w:rPr>
-        <w:lastRenderedPageBreak/>
-        <w:t xml:space="preserve">reproduction, one UCI early warning binary dataset with second semester leakage removed, and one </w:t>
       </w:r>
       <w:proofErr w:type="spellStart"/>
       <w:r>
         <w:rPr>
           <w:lang w:val="en-CA"/>
         </w:rPr>
-        <w:t>oulad</w:t>
       </w:r>
       <w:proofErr w:type="spellEnd"/>
       <w:r>
         <w:rPr>
           <w:lang w:val="en-CA"/>
         </w:rPr>
-        <w:t xml:space="preserve"> early warning binary dataset aggregated at the student module presentation level</w:t>
       </w:r>
-      <w:r>
-        <w:t>.</w:t>
-      </w:r>
+      <w:r/>
     </w:p>
     <w:p>
       <w:pPr>
@@ -442,39 +422,25 @@
         <w:pStyle w:val="ListBullet"/>
       </w:pPr>
       <w:r>
-        <w:t xml:space="preserve">UCI binary early warning created a new attribute called </w:t>
+        <w:t>UCI binary early warning created a new attribute called is_attrition. It deleted all of the variables for the second semester so that we would be using no course data from after the first 75 days.</w:t>
       </w:r>
       <w:proofErr w:type="spellStart"/>
-      <w:r>
-        <w:t>is_attrition</w:t>
-      </w:r>
+      <w:r/>
       <w:proofErr w:type="spellEnd"/>
-      <w:r>
-        <w:t>.</w:t>
-      </w:r>
-      <w:r>
-        <w:t xml:space="preserve"> it deleted all of the variables for the second semester so that we would be using no course data from after the first 75 days</w:t>
-      </w:r>
-      <w:r>
-        <w:t>.</w:t>
-      </w:r>
+      <w:r/>
+      <w:r/>
+      <w:r/>
     </w:p>
     <w:p>
       <w:pPr>
         <w:pStyle w:val="ListBullet"/>
       </w:pPr>
       <w:r>
-        <w:t>OULAD binary early warning defined withdrawn as the positive attrition class</w:t>
+        <w:t>OULAD binary early warning defined withdrawn as the positive attrition class. It was restricted to only activity within the first 75 days.</w:t>
       </w:r>
-      <w:r>
-        <w:t>.</w:t>
-      </w:r>
-      <w:r>
-        <w:t xml:space="preserve"> it was restricted to only activity within the first 75 days</w:t>
-      </w:r>
-      <w:r>
-        <w:t>.</w:t>
-      </w:r>
+      <w:r/>
+      <w:r/>
+      <w:r/>
     </w:p>
     <w:p>
       <w:pPr>
@@ -1442,31 +1408,22 @@
         <w:pStyle w:val="ListBullet"/>
       </w:pPr>
       <w:r>
-        <w:lastRenderedPageBreak/>
-        <w:t>categorical encoding - one-hot encoding with protection for unknown categories</w:t>
+        <w:t>Categorical encoding - one-hot encoding with protection for unknown categories.</w:t>
       </w:r>
-      <w:r>
-        <w:t>.</w:t>
-      </w:r>
+      <w:r/>
     </w:p>
     <w:p>
       <w:pPr>
         <w:pStyle w:val="ListBullet"/>
       </w:pPr>
       <w:r>
-        <w:t xml:space="preserve">numeric scaling - only used </w:t>
+        <w:t>Numeric scaling - only used StandardScaler on logistic regression baseline models; the other two models (tree and boosting) used imputed/clipped raw numeric values instead of scaled versions.</w:t>
       </w:r>
       <w:proofErr w:type="spellStart"/>
-      <w:r>
-        <w:t>StandardScaler</w:t>
-      </w:r>
+      <w:r/>
       <w:proofErr w:type="spellEnd"/>
-      <w:r>
-        <w:t xml:space="preserve"> on logistic regression baseline models; the other two models (tree and boosting) used imputed/clipped raw numeric values instead of scaled versions</w:t>
-      </w:r>
-      <w:r>
-        <w:t>.</w:t>
-      </w:r>
+      <w:r/>
+      <w:r/>
     </w:p>
     <w:p>
       <w:pPr>
@@ -4789,53 +4746,45 @@
         <w:rPr>
           <w:lang w:val="en-CA"/>
         </w:rPr>
-        <w:t>Milestone 4 has set up a reproducible base line for improvements in Milestone 5. The first area for improvement is that the results from the UCI reproductions remain lower than what was reported by Islam et al. (</w:t>
+        <w:t>Milestone 4 has set up a reproducible base line for improvements in Milestone 5. The first area for improvement is that the results from the UCI reproductions remain lower than what was reported by Islam et al. (2025)[1] in their original paper; therefore, we will have to use some form of targeted hyperparameter search or select a different set of preprocessing techniques to get closer to those results. The second area is that both the UCI binary and OULAD binary data sets now offer a much better way to measure how well an approach works compared to where we were before, however these datasets require additional robustness testing including alternative cutoff values, course aware validations, and sensitivity testing on feature families. The third area is that while our selected OULAD baseline includes course ID's as features for training purposes, this is acceptable at baseline levels, but as the focus moves away from baseline performance, we want to subject these features to greater stress testing as the primary objective shifts towards generalization. Fourthly, the current artifacts developed for explaining model behavior are limited to feature importances only, and do not include SHAP-based comparisons; therefore, we expect that the next milestone will expand upon the evaluation of model prediction quality, and begin to evaluate model explanation quality and cross dataset explanation stability.</w:t>
       </w:r>
       <w:proofErr w:type="gramStart"/>
       <w:r>
         <w:rPr>
           <w:lang w:val="en-CA"/>
         </w:rPr>
-        <w:t>2025)[</w:t>
       </w:r>
       <w:proofErr w:type="gramEnd"/>
       <w:r>
         <w:rPr>
           <w:lang w:val="en-CA"/>
         </w:rPr>
-        <w:t xml:space="preserve">1] in their original paper; therefore, we will have to use some form of </w:t>
       </w:r>
       <w:proofErr w:type="spellStart"/>
       <w:r>
         <w:rPr>
           <w:lang w:val="en-CA"/>
         </w:rPr>
-        <w:t>targetted</w:t>
       </w:r>
       <w:proofErr w:type="spellEnd"/>
       <w:r>
         <w:rPr>
           <w:lang w:val="en-CA"/>
         </w:rPr>
-        <w:t xml:space="preserve"> hyperparameter search or select a different set of preprocessing techniques to get closer to those results. The second area is that both the UCI binary and OULAD binary data sets now offer a much better way to measure how well an approach works compared to where we were before, however these datasets require additional robustness testing including alternative cutoff values, course aware validations, and sensitivity testing on feature families. The third area is that while our selected OULAD baseline includes course </w:t>
       </w:r>
       <w:proofErr w:type="gramStart"/>
       <w:r>
         <w:rPr>
           <w:lang w:val="en-CA"/>
         </w:rPr>
-        <w:t>ID's</w:t>
       </w:r>
       <w:proofErr w:type="gramEnd"/>
       <w:r>
         <w:rPr>
           <w:lang w:val="en-CA"/>
         </w:rPr>
-        <w:t xml:space="preserve"> as features for training purposes, this is acceptable at baseline levels, but as the focus moves away from baseline performance, we want to subject these features to greater stress testing as the primary objective shifts towards generalization. Fourthly, the current artifacts developed for explaining model behavior are limited to feature importances only, and do not include SHAP-based comparisons; therefore, we expect that the next milestone will expand upon the evaluation of model prediction quality, and begin to evaluate model explanation quality and cross dataset explanation stability</w:t>
       </w:r>
-      <w:r>
-        <w:t>.</w:t>
-      </w:r>
+      <w:r/>
     </w:p>
     <w:p>
       <w:pPr>

</xml_diff>